<commit_message>
nmv 21 07 2026
</commit_message>
<xml_diff>
--- a/TS-Padam/TS-2.2/TS 2.2 Malayalam Pada Paatam Corrections.docx
+++ b/TS-Padam/TS-2.2/TS 2.2 Malayalam Pada Paatam Corrections.docx
@@ -14,585 +14,6 @@
         </w:rPr>
       </w:pPr>
       <w:bookmarkStart w:id="0" w:name="_Hlk136094271"/>
-      <w:r>
-        <w:rPr>
-          <w:b/>
-          <w:bCs/>
-          <w:sz w:val="32"/>
-          <w:szCs w:val="32"/>
-          <w:u w:val="single"/>
-        </w:rPr>
-        <w:t xml:space="preserve">TS Pada Paatam – TS 2.2 Malayalam </w:t>
-      </w:r>
-      <w:r>
-        <w:rPr>
-          <w:b/>
-          <w:bCs/>
-          <w:sz w:val="32"/>
-          <w:szCs w:val="32"/>
-          <w:u w:val="single"/>
-        </w:rPr>
-        <w:t>Corrections</w:t>
-      </w:r>
-      <w:r>
-        <w:rPr>
-          <w:b/>
-          <w:bCs/>
-          <w:sz w:val="32"/>
-          <w:szCs w:val="32"/>
-          <w:u w:val="single"/>
-        </w:rPr>
-        <w:t xml:space="preserve"> </w:t>
-      </w:r>
-      <w:r>
-        <w:rPr>
-          <w:b/>
-          <w:bCs/>
-          <w:sz w:val="32"/>
-          <w:szCs w:val="32"/>
-          <w:u w:val="single"/>
-        </w:rPr>
-        <w:t xml:space="preserve">– Observed </w:t>
-      </w:r>
-      <w:proofErr w:type="gramStart"/>
-      <w:r>
-        <w:rPr>
-          <w:b/>
-          <w:bCs/>
-          <w:sz w:val="32"/>
-          <w:szCs w:val="32"/>
-          <w:u w:val="single"/>
-        </w:rPr>
-        <w:t xml:space="preserve">till </w:t>
-      </w:r>
-      <w:r>
-        <w:rPr>
-          <w:b/>
-          <w:bCs/>
-          <w:sz w:val="32"/>
-          <w:szCs w:val="32"/>
-          <w:highlight w:val="red"/>
-          <w:u w:val="single"/>
-        </w:rPr>
-        <w:t>????</w:t>
-      </w:r>
-      <w:proofErr w:type="gramEnd"/>
-    </w:p>
-    <w:p>
-      <w:pPr>
-        <w:jc w:val="center"/>
-        <w:rPr>
-          <w:b/>
-          <w:bCs/>
-        </w:rPr>
-      </w:pPr>
-      <w:r>
-        <w:rPr>
-          <w:b/>
-          <w:bCs/>
-        </w:rPr>
-        <w:t>(ignore those which are already incorporated in your book’s version and date)</w:t>
-      </w:r>
-    </w:p>
-    <w:tbl>
-      <w:tblPr>
-        <w:tblW w:w="13662" w:type="dxa"/>
-        <w:tblInd w:w="-318" w:type="dxa"/>
-        <w:tblBorders>
-          <w:top w:val="single" w:sz="4" w:space="0" w:color="000000"/>
-          <w:left w:val="single" w:sz="4" w:space="0" w:color="000000"/>
-          <w:bottom w:val="single" w:sz="4" w:space="0" w:color="000000"/>
-          <w:right w:val="single" w:sz="4" w:space="0" w:color="000000"/>
-          <w:insideH w:val="single" w:sz="4" w:space="0" w:color="000000"/>
-          <w:insideV w:val="single" w:sz="4" w:space="0" w:color="000000"/>
-        </w:tblBorders>
-        <w:tblLook w:val="04A0" w:firstRow="1" w:lastRow="0" w:firstColumn="1" w:lastColumn="0" w:noHBand="0" w:noVBand="1"/>
-      </w:tblPr>
-      <w:tblGrid>
-        <w:gridCol w:w="3290"/>
-        <w:gridCol w:w="5103"/>
-        <w:gridCol w:w="5220"/>
-        <w:gridCol w:w="49"/>
-      </w:tblGrid>
-      <w:tr>
-        <w:trPr>
-          <w:gridAfter w:val="1"/>
-          <w:wAfter w:w="49" w:type="dxa"/>
-        </w:trPr>
-        <w:tc>
-          <w:tcPr>
-            <w:tcW w:w="3290" w:type="dxa"/>
-          </w:tcPr>
-          <w:p>
-            <w:pPr>
-              <w:spacing w:before="0" w:line="240" w:lineRule="auto"/>
-              <w:jc w:val="center"/>
-              <w:rPr>
-                <w:b/>
-                <w:sz w:val="28"/>
-                <w:szCs w:val="32"/>
-              </w:rPr>
-            </w:pPr>
-            <w:r>
-              <w:rPr>
-                <w:b/>
-                <w:sz w:val="28"/>
-                <w:szCs w:val="32"/>
-              </w:rPr>
-              <w:t>Section, Paragraph</w:t>
-            </w:r>
-          </w:p>
-          <w:p>
-            <w:pPr>
-              <w:spacing w:before="0" w:line="240" w:lineRule="auto"/>
-              <w:jc w:val="center"/>
-              <w:rPr>
-                <w:b/>
-                <w:sz w:val="28"/>
-                <w:szCs w:val="32"/>
-              </w:rPr>
-            </w:pPr>
-            <w:r>
-              <w:rPr>
-                <w:b/>
-                <w:sz w:val="28"/>
-                <w:szCs w:val="32"/>
-              </w:rPr>
-              <w:t>Reference</w:t>
-            </w:r>
-          </w:p>
-        </w:tc>
-        <w:tc>
-          <w:tcPr>
-            <w:tcW w:w="5103" w:type="dxa"/>
-          </w:tcPr>
-          <w:p>
-            <w:pPr>
-              <w:spacing w:before="0" w:line="240" w:lineRule="auto"/>
-              <w:jc w:val="center"/>
-              <w:rPr>
-                <w:b/>
-                <w:sz w:val="28"/>
-                <w:szCs w:val="32"/>
-              </w:rPr>
-            </w:pPr>
-            <w:r>
-              <w:rPr>
-                <w:b/>
-                <w:sz w:val="28"/>
-                <w:szCs w:val="32"/>
-              </w:rPr>
-              <w:t>As Printed</w:t>
-            </w:r>
-          </w:p>
-        </w:tc>
-        <w:tc>
-          <w:tcPr>
-            <w:tcW w:w="5220" w:type="dxa"/>
-          </w:tcPr>
-          <w:p>
-            <w:pPr>
-              <w:spacing w:before="0" w:line="240" w:lineRule="auto"/>
-              <w:ind w:right="-18"/>
-              <w:jc w:val="center"/>
-              <w:rPr>
-                <w:b/>
-                <w:sz w:val="28"/>
-                <w:szCs w:val="32"/>
-              </w:rPr>
-            </w:pPr>
-            <w:r>
-              <w:rPr>
-                <w:b/>
-                <w:sz w:val="28"/>
-                <w:szCs w:val="32"/>
-              </w:rPr>
-              <w:t>To be read as or corrected as</w:t>
-            </w:r>
-          </w:p>
-        </w:tc>
-      </w:tr>
-      <w:tr>
-        <w:trPr>
-          <w:trHeight w:val="1048"/>
-        </w:trPr>
-        <w:tc>
-          <w:tcPr>
-            <w:tcW w:w="3290" w:type="dxa"/>
-            <w:tcBorders>
-              <w:top w:val="single" w:sz="4" w:space="0" w:color="000000"/>
-              <w:left w:val="single" w:sz="4" w:space="0" w:color="000000"/>
-              <w:bottom w:val="single" w:sz="4" w:space="0" w:color="000000"/>
-              <w:right w:val="single" w:sz="4" w:space="0" w:color="000000"/>
-            </w:tcBorders>
-          </w:tcPr>
-          <w:p>
-            <w:pPr>
-              <w:widowControl w:val="0"/>
-              <w:autoSpaceDE w:val="0"/>
-              <w:autoSpaceDN w:val="0"/>
-              <w:adjustRightInd w:val="0"/>
-              <w:spacing w:before="0" w:line="264" w:lineRule="auto"/>
-              <w:ind w:right="-320"/>
-              <w:jc w:val="both"/>
-              <w:rPr>
-                <w:rFonts w:eastAsia="Times New Roman" w:cs="Arial"/>
-                <w:b/>
-                <w:sz w:val="28"/>
-                <w:szCs w:val="28"/>
-                <w:lang w:eastAsia="en-IN" w:bidi="ml-IN"/>
-              </w:rPr>
-            </w:pPr>
-            <w:r>
-              <w:rPr>
-                <w:rFonts w:eastAsia="Times New Roman" w:cs="Arial"/>
-                <w:b/>
-                <w:sz w:val="28"/>
-                <w:szCs w:val="28"/>
-                <w:lang w:eastAsia="en-IN" w:bidi="ml-IN"/>
-              </w:rPr>
-              <w:t>TS 2.</w:t>
-            </w:r>
-            <w:r>
-              <w:rPr>
-                <w:rFonts w:eastAsia="Times New Roman" w:cs="Arial"/>
-                <w:b/>
-                <w:sz w:val="28"/>
-                <w:szCs w:val="28"/>
-                <w:lang w:eastAsia="en-IN" w:bidi="ml-IN"/>
-              </w:rPr>
-              <w:t>2.9.5</w:t>
-            </w:r>
-            <w:r>
-              <w:rPr>
-                <w:rFonts w:eastAsia="Times New Roman" w:cs="Arial"/>
-                <w:b/>
-                <w:sz w:val="28"/>
-                <w:szCs w:val="28"/>
-                <w:lang w:eastAsia="en-IN" w:bidi="ml-IN"/>
-              </w:rPr>
-              <w:t xml:space="preserve"> </w:t>
-            </w:r>
-            <w:r>
-              <w:rPr>
-                <w:rFonts w:eastAsia="Times New Roman" w:cs="Arial"/>
-                <w:b/>
-                <w:sz w:val="28"/>
-                <w:szCs w:val="28"/>
-                <w:lang w:eastAsia="en-IN" w:bidi="ml-IN"/>
-              </w:rPr>
-              <w:t xml:space="preserve">- </w:t>
-            </w:r>
-            <w:r>
-              <w:rPr>
-                <w:rFonts w:eastAsia="Times New Roman" w:cs="Arial"/>
-                <w:b/>
-                <w:sz w:val="28"/>
-                <w:szCs w:val="28"/>
-                <w:lang w:eastAsia="en-IN" w:bidi="ml-IN"/>
-              </w:rPr>
-              <w:t>Vaakyam</w:t>
-            </w:r>
-          </w:p>
-          <w:p>
-            <w:pPr>
-              <w:widowControl w:val="0"/>
-              <w:autoSpaceDE w:val="0"/>
-              <w:autoSpaceDN w:val="0"/>
-              <w:adjustRightInd w:val="0"/>
-              <w:spacing w:before="0" w:line="264" w:lineRule="auto"/>
-              <w:ind w:right="-320"/>
-              <w:jc w:val="both"/>
-              <w:rPr>
-                <w:rFonts w:eastAsia="Times New Roman" w:cs="Arial"/>
-                <w:b/>
-                <w:sz w:val="28"/>
-                <w:szCs w:val="28"/>
-                <w:lang w:eastAsia="en-IN" w:bidi="ml-IN"/>
-              </w:rPr>
-            </w:pPr>
-            <w:r>
-              <w:rPr>
-                <w:rFonts w:eastAsia="Times New Roman" w:cs="Arial"/>
-                <w:b/>
-                <w:sz w:val="28"/>
-                <w:szCs w:val="28"/>
-                <w:lang w:eastAsia="en-IN" w:bidi="ml-IN"/>
-              </w:rPr>
-              <w:t>Line</w:t>
-            </w:r>
-            <w:r>
-              <w:rPr>
-                <w:rFonts w:eastAsia="Times New Roman" w:cs="Arial"/>
-                <w:b/>
-                <w:sz w:val="28"/>
-                <w:szCs w:val="28"/>
-                <w:lang w:eastAsia="en-IN" w:bidi="ml-IN"/>
-              </w:rPr>
-              <w:t xml:space="preserve"> No. </w:t>
-            </w:r>
-            <w:r>
-              <w:rPr>
-                <w:rFonts w:eastAsia="Times New Roman" w:cs="Arial"/>
-                <w:b/>
-                <w:sz w:val="28"/>
-                <w:szCs w:val="28"/>
-                <w:lang w:eastAsia="en-IN" w:bidi="ml-IN"/>
-              </w:rPr>
-              <w:t>6</w:t>
-            </w:r>
-          </w:p>
-          <w:p>
-            <w:pPr>
-              <w:widowControl w:val="0"/>
-              <w:autoSpaceDE w:val="0"/>
-              <w:autoSpaceDN w:val="0"/>
-              <w:adjustRightInd w:val="0"/>
-              <w:spacing w:before="0" w:line="264" w:lineRule="auto"/>
-              <w:ind w:right="-320"/>
-              <w:jc w:val="both"/>
-              <w:rPr>
-                <w:rFonts w:eastAsia="Times New Roman" w:cs="Arial"/>
-                <w:b/>
-                <w:sz w:val="28"/>
-                <w:szCs w:val="28"/>
-                <w:lang w:eastAsia="en-IN" w:bidi="ml-IN"/>
-              </w:rPr>
-            </w:pPr>
-            <w:r>
-              <w:rPr>
-                <w:rFonts w:eastAsia="Times New Roman" w:cs="Arial"/>
-                <w:b/>
-                <w:sz w:val="28"/>
-                <w:szCs w:val="28"/>
-                <w:lang w:eastAsia="en-IN" w:bidi="ml-IN"/>
-              </w:rPr>
-              <w:t>Panchaati No.</w:t>
-            </w:r>
-            <w:r>
-              <w:rPr>
-                <w:rFonts w:eastAsia="Times New Roman" w:cs="Arial"/>
-                <w:b/>
-                <w:sz w:val="28"/>
-                <w:szCs w:val="28"/>
-                <w:lang w:eastAsia="en-IN" w:bidi="ml-IN"/>
-              </w:rPr>
-              <w:t xml:space="preserve"> 50</w:t>
-            </w:r>
-          </w:p>
-        </w:tc>
-        <w:tc>
-          <w:tcPr>
-            <w:tcW w:w="5103" w:type="dxa"/>
-            <w:tcBorders>
-              <w:top w:val="single" w:sz="4" w:space="0" w:color="000000"/>
-              <w:left w:val="single" w:sz="4" w:space="0" w:color="000000"/>
-              <w:bottom w:val="single" w:sz="4" w:space="0" w:color="000000"/>
-              <w:right w:val="single" w:sz="4" w:space="0" w:color="000000"/>
-            </w:tcBorders>
-          </w:tcPr>
-          <w:p>
-            <w:pPr>
-              <w:widowControl w:val="0"/>
-              <w:autoSpaceDE w:val="0"/>
-              <w:autoSpaceDN w:val="0"/>
-              <w:adjustRightInd w:val="0"/>
-              <w:spacing w:before="0" w:line="240" w:lineRule="auto"/>
-              <w:ind w:right="-22"/>
-              <w:rPr>
-                <w:rFonts w:ascii="BRH Malayalam Extra" w:hAnsi="BRH Malayalam Extra" w:cs="BRH Malayalam Extra"/>
-                <w:sz w:val="40"/>
-                <w:szCs w:val="40"/>
-              </w:rPr>
-            </w:pPr>
-            <w:r>
-              <w:rPr>
-                <w:rFonts w:ascii="BRH Malayalam Extra" w:hAnsi="BRH Malayalam Extra" w:cs="BRH Malayalam Extra"/>
-                <w:sz w:val="40"/>
-                <w:szCs w:val="40"/>
-              </w:rPr>
-              <w:t>öexZ</w:t>
-            </w:r>
-            <w:r>
-              <w:rPr>
-                <w:rFonts w:ascii="BRH Malayalam" w:hAnsi="BRH Malayalam" w:cs="BRH Malayalam"/>
-                <w:sz w:val="40"/>
-                <w:szCs w:val="40"/>
-              </w:rPr>
-              <w:t>sþ</w:t>
-            </w:r>
-            <w:r>
-              <w:rPr>
-                <w:rFonts w:ascii="BRH Malayalam Extra" w:hAnsi="BRH Malayalam Extra" w:cs="BRH Malayalam Extra"/>
-                <w:sz w:val="40"/>
-                <w:szCs w:val="40"/>
-              </w:rPr>
-              <w:t>p</w:t>
-            </w:r>
-            <w:r>
-              <w:rPr>
-                <w:rFonts w:ascii="BRH Malayalam Extra" w:hAnsi="BRH Malayalam Extra" w:cs="BRH Malayalam Extra"/>
-                <w:sz w:val="40"/>
-                <w:szCs w:val="40"/>
-                <w:highlight w:val="yellow"/>
-              </w:rPr>
-              <w:t>d</w:t>
-            </w:r>
-            <w:r>
-              <w:rPr>
-                <w:rFonts w:ascii="BRH Malayalam Extra" w:hAnsi="BRH Malayalam Extra" w:cs="BRH Malayalam Extra"/>
-                <w:sz w:val="34"/>
-                <w:szCs w:val="40"/>
-              </w:rPr>
-              <w:t>–</w:t>
-            </w:r>
-            <w:r>
-              <w:rPr>
-                <w:rFonts w:ascii="BRH Malayalam Extra" w:hAnsi="BRH Malayalam Extra" w:cs="BRH Malayalam Extra"/>
-                <w:sz w:val="40"/>
-                <w:szCs w:val="40"/>
-              </w:rPr>
-              <w:t>sõx—„„Kx</w:t>
-            </w:r>
-            <w:r>
-              <w:rPr>
-                <w:rFonts w:ascii="BRH Malayalam Extra" w:hAnsi="BRH Malayalam Extra" w:cs="BRH Malayalam Extra"/>
-                <w:sz w:val="34"/>
-                <w:szCs w:val="40"/>
-              </w:rPr>
-              <w:t>–</w:t>
-            </w:r>
-            <w:r>
-              <w:rPr>
-                <w:rFonts w:ascii="BRH Malayalam Extra" w:hAnsi="BRH Malayalam Extra" w:cs="BRH Malayalam Extra"/>
-                <w:sz w:val="40"/>
-                <w:szCs w:val="40"/>
-              </w:rPr>
-              <w:t>¥m</w:t>
-            </w:r>
-          </w:p>
-        </w:tc>
-        <w:tc>
-          <w:tcPr>
-            <w:tcW w:w="5245" w:type="dxa"/>
-            <w:gridSpan w:val="2"/>
-            <w:tcBorders>
-              <w:top w:val="single" w:sz="4" w:space="0" w:color="000000"/>
-              <w:left w:val="single" w:sz="4" w:space="0" w:color="000000"/>
-              <w:bottom w:val="single" w:sz="4" w:space="0" w:color="000000"/>
-              <w:right w:val="single" w:sz="4" w:space="0" w:color="000000"/>
-            </w:tcBorders>
-          </w:tcPr>
-          <w:p>
-            <w:pPr>
-              <w:widowControl w:val="0"/>
-              <w:autoSpaceDE w:val="0"/>
-              <w:autoSpaceDN w:val="0"/>
-              <w:adjustRightInd w:val="0"/>
-              <w:spacing w:before="0" w:line="240" w:lineRule="auto"/>
-              <w:ind w:right="-22"/>
-              <w:rPr>
-                <w:rFonts w:ascii="BRH Malayalam Extra" w:hAnsi="BRH Malayalam Extra" w:cs="BRH Malayalam Extra"/>
-                <w:sz w:val="40"/>
-                <w:szCs w:val="40"/>
-              </w:rPr>
-            </w:pPr>
-            <w:r>
-              <w:rPr>
-                <w:rFonts w:ascii="BRH Malayalam Extra" w:hAnsi="BRH Malayalam Extra" w:cs="BRH Malayalam Extra"/>
-                <w:sz w:val="40"/>
-                <w:szCs w:val="40"/>
-              </w:rPr>
-              <w:t>öexZ</w:t>
-            </w:r>
-            <w:r>
-              <w:rPr>
-                <w:rFonts w:ascii="BRH Malayalam" w:hAnsi="BRH Malayalam" w:cs="BRH Malayalam"/>
-                <w:sz w:val="40"/>
-                <w:szCs w:val="40"/>
-              </w:rPr>
-              <w:t>sþ</w:t>
-            </w:r>
-            <w:r>
-              <w:rPr>
-                <w:rFonts w:ascii="BRH Malayalam Extra" w:hAnsi="BRH Malayalam Extra" w:cs="BRH Malayalam Extra"/>
-                <w:sz w:val="40"/>
-                <w:szCs w:val="40"/>
-                <w:highlight w:val="green"/>
-              </w:rPr>
-              <w:t>p</w:t>
-            </w:r>
-            <w:r>
-              <w:rPr>
-                <w:rFonts w:ascii="BRH Malayalam Extra" w:hAnsi="BRH Malayalam Extra" w:cs="BRH Malayalam Extra"/>
-                <w:sz w:val="34"/>
-                <w:szCs w:val="40"/>
-              </w:rPr>
-              <w:t>–</w:t>
-            </w:r>
-            <w:r>
-              <w:rPr>
-                <w:rFonts w:ascii="BRH Malayalam Extra" w:hAnsi="BRH Malayalam Extra" w:cs="BRH Malayalam Extra"/>
-                <w:sz w:val="40"/>
-                <w:szCs w:val="40"/>
-              </w:rPr>
-              <w:t>dsõx—„„Kx</w:t>
-            </w:r>
-            <w:r>
-              <w:rPr>
-                <w:rFonts w:ascii="BRH Malayalam Extra" w:hAnsi="BRH Malayalam Extra" w:cs="BRH Malayalam Extra"/>
-                <w:sz w:val="34"/>
-                <w:szCs w:val="40"/>
-              </w:rPr>
-              <w:t>–</w:t>
-            </w:r>
-            <w:r>
-              <w:rPr>
-                <w:rFonts w:ascii="BRH Malayalam Extra" w:hAnsi="BRH Malayalam Extra" w:cs="BRH Malayalam Extra"/>
-                <w:sz w:val="40"/>
-                <w:szCs w:val="40"/>
-              </w:rPr>
-              <w:t>¥m</w:t>
-            </w:r>
-          </w:p>
-        </w:tc>
-      </w:tr>
-    </w:tbl>
-    <w:p>
-      <w:pPr>
-        <w:jc w:val="center"/>
-        <w:rPr>
-          <w:b/>
-          <w:bCs/>
-          <w:sz w:val="32"/>
-          <w:szCs w:val="32"/>
-          <w:u w:val="single"/>
-        </w:rPr>
-      </w:pPr>
-    </w:p>
-    <w:p>
-      <w:pPr>
-        <w:jc w:val="center"/>
-        <w:rPr>
-          <w:b/>
-          <w:bCs/>
-          <w:sz w:val="32"/>
-          <w:szCs w:val="32"/>
-          <w:u w:val="single"/>
-        </w:rPr>
-      </w:pPr>
-    </w:p>
-    <w:p>
-      <w:pPr>
-        <w:jc w:val="center"/>
-        <w:rPr>
-          <w:b/>
-          <w:bCs/>
-          <w:sz w:val="32"/>
-          <w:szCs w:val="32"/>
-          <w:u w:val="single"/>
-        </w:rPr>
-      </w:pPr>
       <w:r>
         <w:rPr>
           <w:b/>
@@ -2014,6 +1435,350 @@
       </w:tr>
       <w:tr>
         <w:trPr>
+          <w:trHeight w:val="1048"/>
+        </w:trPr>
+        <w:tc>
+          <w:tcPr>
+            <w:tcW w:w="3290" w:type="dxa"/>
+            <w:tcBorders>
+              <w:top w:val="single" w:sz="4" w:space="0" w:color="000000"/>
+              <w:left w:val="single" w:sz="4" w:space="0" w:color="000000"/>
+              <w:bottom w:val="single" w:sz="4" w:space="0" w:color="000000"/>
+              <w:right w:val="single" w:sz="4" w:space="0" w:color="000000"/>
+            </w:tcBorders>
+          </w:tcPr>
+          <w:p>
+            <w:pPr>
+              <w:widowControl w:val="0"/>
+              <w:autoSpaceDE w:val="0"/>
+              <w:autoSpaceDN w:val="0"/>
+              <w:adjustRightInd w:val="0"/>
+              <w:spacing w:before="0" w:line="264" w:lineRule="auto"/>
+              <w:ind w:right="-320"/>
+              <w:jc w:val="both"/>
+              <w:rPr>
+                <w:rFonts w:eastAsia="Times New Roman" w:cs="Arial"/>
+                <w:b/>
+                <w:sz w:val="28"/>
+                <w:szCs w:val="28"/>
+                <w:lang w:eastAsia="en-IN" w:bidi="ml-IN"/>
+              </w:rPr>
+            </w:pPr>
+            <w:r>
+              <w:rPr>
+                <w:rFonts w:eastAsia="Times New Roman" w:cs="Arial"/>
+                <w:b/>
+                <w:sz w:val="28"/>
+                <w:szCs w:val="28"/>
+                <w:lang w:eastAsia="en-IN" w:bidi="ml-IN"/>
+              </w:rPr>
+              <w:t>TS 2.</w:t>
+            </w:r>
+            <w:r>
+              <w:rPr>
+                <w:rFonts w:eastAsia="Times New Roman" w:cs="Arial"/>
+                <w:b/>
+                <w:sz w:val="28"/>
+                <w:szCs w:val="28"/>
+                <w:lang w:eastAsia="en-IN" w:bidi="ml-IN"/>
+              </w:rPr>
+              <w:t>2.9.5</w:t>
+            </w:r>
+            <w:r>
+              <w:rPr>
+                <w:rFonts w:eastAsia="Times New Roman" w:cs="Arial"/>
+                <w:b/>
+                <w:sz w:val="28"/>
+                <w:szCs w:val="28"/>
+                <w:lang w:eastAsia="en-IN" w:bidi="ml-IN"/>
+              </w:rPr>
+              <w:t xml:space="preserve"> </w:t>
+            </w:r>
+            <w:r>
+              <w:rPr>
+                <w:rFonts w:eastAsia="Times New Roman" w:cs="Arial"/>
+                <w:b/>
+                <w:sz w:val="28"/>
+                <w:szCs w:val="28"/>
+                <w:lang w:eastAsia="en-IN" w:bidi="ml-IN"/>
+              </w:rPr>
+              <w:t xml:space="preserve">- </w:t>
+            </w:r>
+            <w:r>
+              <w:rPr>
+                <w:rFonts w:eastAsia="Times New Roman" w:cs="Arial"/>
+                <w:b/>
+                <w:sz w:val="28"/>
+                <w:szCs w:val="28"/>
+                <w:lang w:eastAsia="en-IN" w:bidi="ml-IN"/>
+              </w:rPr>
+              <w:t>Vaakyam</w:t>
+            </w:r>
+          </w:p>
+          <w:p>
+            <w:pPr>
+              <w:widowControl w:val="0"/>
+              <w:autoSpaceDE w:val="0"/>
+              <w:autoSpaceDN w:val="0"/>
+              <w:adjustRightInd w:val="0"/>
+              <w:spacing w:before="0" w:line="264" w:lineRule="auto"/>
+              <w:ind w:right="-320"/>
+              <w:jc w:val="both"/>
+              <w:rPr>
+                <w:rFonts w:eastAsia="Times New Roman" w:cs="Arial"/>
+                <w:b/>
+                <w:sz w:val="28"/>
+                <w:szCs w:val="28"/>
+                <w:lang w:eastAsia="en-IN" w:bidi="ml-IN"/>
+              </w:rPr>
+            </w:pPr>
+            <w:r>
+              <w:rPr>
+                <w:rFonts w:eastAsia="Times New Roman" w:cs="Arial"/>
+                <w:b/>
+                <w:sz w:val="28"/>
+                <w:szCs w:val="28"/>
+                <w:lang w:eastAsia="en-IN" w:bidi="ml-IN"/>
+              </w:rPr>
+              <w:t>Line</w:t>
+            </w:r>
+            <w:r>
+              <w:rPr>
+                <w:rFonts w:eastAsia="Times New Roman" w:cs="Arial"/>
+                <w:b/>
+                <w:sz w:val="28"/>
+                <w:szCs w:val="28"/>
+                <w:lang w:eastAsia="en-IN" w:bidi="ml-IN"/>
+              </w:rPr>
+              <w:t xml:space="preserve"> No. </w:t>
+            </w:r>
+            <w:r>
+              <w:rPr>
+                <w:rFonts w:eastAsia="Times New Roman" w:cs="Arial"/>
+                <w:b/>
+                <w:sz w:val="28"/>
+                <w:szCs w:val="28"/>
+                <w:lang w:eastAsia="en-IN" w:bidi="ml-IN"/>
+              </w:rPr>
+              <w:t>6</w:t>
+            </w:r>
+          </w:p>
+          <w:p>
+            <w:pPr>
+              <w:widowControl w:val="0"/>
+              <w:autoSpaceDE w:val="0"/>
+              <w:autoSpaceDN w:val="0"/>
+              <w:adjustRightInd w:val="0"/>
+              <w:spacing w:before="0" w:line="264" w:lineRule="auto"/>
+              <w:ind w:right="-320"/>
+              <w:jc w:val="both"/>
+              <w:rPr>
+                <w:rFonts w:eastAsia="Times New Roman" w:cs="Arial"/>
+                <w:b/>
+                <w:sz w:val="28"/>
+                <w:szCs w:val="28"/>
+                <w:lang w:eastAsia="en-IN" w:bidi="ml-IN"/>
+              </w:rPr>
+            </w:pPr>
+            <w:r>
+              <w:rPr>
+                <w:rFonts w:eastAsia="Times New Roman" w:cs="Arial"/>
+                <w:b/>
+                <w:sz w:val="28"/>
+                <w:szCs w:val="28"/>
+                <w:lang w:eastAsia="en-IN" w:bidi="ml-IN"/>
+              </w:rPr>
+              <w:t>Panchaati No.</w:t>
+            </w:r>
+            <w:r>
+              <w:rPr>
+                <w:rFonts w:eastAsia="Times New Roman" w:cs="Arial"/>
+                <w:b/>
+                <w:sz w:val="28"/>
+                <w:szCs w:val="28"/>
+                <w:lang w:eastAsia="en-IN" w:bidi="ml-IN"/>
+              </w:rPr>
+              <w:t xml:space="preserve"> 50</w:t>
+            </w:r>
+          </w:p>
+        </w:tc>
+        <w:tc>
+          <w:tcPr>
+            <w:tcW w:w="5103" w:type="dxa"/>
+            <w:tcBorders>
+              <w:top w:val="single" w:sz="4" w:space="0" w:color="000000"/>
+              <w:left w:val="single" w:sz="4" w:space="0" w:color="000000"/>
+              <w:bottom w:val="single" w:sz="4" w:space="0" w:color="000000"/>
+              <w:right w:val="single" w:sz="4" w:space="0" w:color="000000"/>
+            </w:tcBorders>
+          </w:tcPr>
+          <w:p>
+            <w:pPr>
+              <w:widowControl w:val="0"/>
+              <w:autoSpaceDE w:val="0"/>
+              <w:autoSpaceDN w:val="0"/>
+              <w:adjustRightInd w:val="0"/>
+              <w:spacing w:before="0" w:line="240" w:lineRule="auto"/>
+              <w:ind w:right="-22"/>
+              <w:rPr>
+                <w:rFonts w:ascii="BRH Malayalam Extra" w:hAnsi="BRH Malayalam Extra" w:cs="BRH Malayalam Extra"/>
+                <w:sz w:val="40"/>
+                <w:szCs w:val="40"/>
+              </w:rPr>
+            </w:pPr>
+            <w:r>
+              <w:rPr>
+                <w:rFonts w:ascii="BRH Malayalam Extra" w:hAnsi="BRH Malayalam Extra" w:cs="BRH Malayalam Extra"/>
+                <w:sz w:val="40"/>
+                <w:szCs w:val="40"/>
+              </w:rPr>
+              <w:t>öexZ</w:t>
+            </w:r>
+            <w:r>
+              <w:rPr>
+                <w:rFonts w:ascii="BRH Malayalam" w:hAnsi="BRH Malayalam" w:cs="BRH Malayalam"/>
+                <w:sz w:val="40"/>
+                <w:szCs w:val="40"/>
+              </w:rPr>
+              <w:t>sþ</w:t>
+            </w:r>
+            <w:r>
+              <w:rPr>
+                <w:rFonts w:ascii="BRH Malayalam Extra" w:hAnsi="BRH Malayalam Extra" w:cs="BRH Malayalam Extra"/>
+                <w:sz w:val="40"/>
+                <w:szCs w:val="40"/>
+              </w:rPr>
+              <w:t>p</w:t>
+            </w:r>
+            <w:r>
+              <w:rPr>
+                <w:rFonts w:ascii="BRH Malayalam Extra" w:hAnsi="BRH Malayalam Extra" w:cs="BRH Malayalam Extra"/>
+                <w:sz w:val="40"/>
+                <w:szCs w:val="40"/>
+                <w:highlight w:val="yellow"/>
+              </w:rPr>
+              <w:t>d</w:t>
+            </w:r>
+            <w:r>
+              <w:rPr>
+                <w:rFonts w:ascii="BRH Malayalam Extra" w:hAnsi="BRH Malayalam Extra" w:cs="BRH Malayalam Extra"/>
+                <w:sz w:val="34"/>
+                <w:szCs w:val="40"/>
+              </w:rPr>
+              <w:t>–</w:t>
+            </w:r>
+            <w:r>
+              <w:rPr>
+                <w:rFonts w:ascii="BRH Malayalam Extra" w:hAnsi="BRH Malayalam Extra" w:cs="BRH Malayalam Extra"/>
+                <w:sz w:val="40"/>
+                <w:szCs w:val="40"/>
+              </w:rPr>
+              <w:t>sõx—„„Kx</w:t>
+            </w:r>
+            <w:r>
+              <w:rPr>
+                <w:rFonts w:ascii="BRH Malayalam Extra" w:hAnsi="BRH Malayalam Extra" w:cs="BRH Malayalam Extra"/>
+                <w:sz w:val="34"/>
+                <w:szCs w:val="40"/>
+              </w:rPr>
+              <w:t>–</w:t>
+            </w:r>
+            <w:r>
+              <w:rPr>
+                <w:rFonts w:ascii="BRH Malayalam Extra" w:hAnsi="BRH Malayalam Extra" w:cs="BRH Malayalam Extra"/>
+                <w:sz w:val="40"/>
+                <w:szCs w:val="40"/>
+              </w:rPr>
+              <w:t>¥m</w:t>
+            </w:r>
+          </w:p>
+        </w:tc>
+        <w:tc>
+          <w:tcPr>
+            <w:tcW w:w="5269" w:type="dxa"/>
+            <w:tcBorders>
+              <w:top w:val="single" w:sz="4" w:space="0" w:color="000000"/>
+              <w:left w:val="single" w:sz="4" w:space="0" w:color="000000"/>
+              <w:bottom w:val="single" w:sz="4" w:space="0" w:color="000000"/>
+              <w:right w:val="single" w:sz="4" w:space="0" w:color="000000"/>
+            </w:tcBorders>
+          </w:tcPr>
+          <w:p>
+            <w:pPr>
+              <w:widowControl w:val="0"/>
+              <w:autoSpaceDE w:val="0"/>
+              <w:autoSpaceDN w:val="0"/>
+              <w:adjustRightInd w:val="0"/>
+              <w:spacing w:before="0" w:line="240" w:lineRule="auto"/>
+              <w:ind w:right="-22"/>
+              <w:rPr>
+                <w:rFonts w:ascii="BRH Malayalam Extra" w:hAnsi="BRH Malayalam Extra" w:cs="BRH Malayalam Extra"/>
+                <w:sz w:val="40"/>
+                <w:szCs w:val="40"/>
+              </w:rPr>
+            </w:pPr>
+            <w:r>
+              <w:rPr>
+                <w:rFonts w:ascii="BRH Malayalam Extra" w:hAnsi="BRH Malayalam Extra" w:cs="BRH Malayalam Extra"/>
+                <w:sz w:val="40"/>
+                <w:szCs w:val="40"/>
+              </w:rPr>
+              <w:t>öexZ</w:t>
+            </w:r>
+            <w:r>
+              <w:rPr>
+                <w:rFonts w:ascii="BRH Malayalam" w:hAnsi="BRH Malayalam" w:cs="BRH Malayalam"/>
+                <w:sz w:val="40"/>
+                <w:szCs w:val="40"/>
+              </w:rPr>
+              <w:t>sþ</w:t>
+            </w:r>
+            <w:r>
+              <w:rPr>
+                <w:rFonts w:ascii="BRH Malayalam Extra" w:hAnsi="BRH Malayalam Extra" w:cs="BRH Malayalam Extra"/>
+                <w:sz w:val="40"/>
+                <w:szCs w:val="40"/>
+                <w:highlight w:val="green"/>
+              </w:rPr>
+              <w:t>p</w:t>
+            </w:r>
+            <w:r>
+              <w:rPr>
+                <w:rFonts w:ascii="BRH Malayalam Extra" w:hAnsi="BRH Malayalam Extra" w:cs="BRH Malayalam Extra"/>
+                <w:sz w:val="34"/>
+                <w:szCs w:val="40"/>
+              </w:rPr>
+              <w:t>–</w:t>
+            </w:r>
+            <w:r>
+              <w:rPr>
+                <w:rFonts w:ascii="BRH Malayalam Extra" w:hAnsi="BRH Malayalam Extra" w:cs="BRH Malayalam Extra"/>
+                <w:sz w:val="40"/>
+                <w:szCs w:val="40"/>
+              </w:rPr>
+              <w:t>dsõx—„„Kx</w:t>
+            </w:r>
+            <w:r>
+              <w:rPr>
+                <w:rFonts w:ascii="BRH Malayalam Extra" w:hAnsi="BRH Malayalam Extra" w:cs="BRH Malayalam Extra"/>
+                <w:sz w:val="34"/>
+                <w:szCs w:val="40"/>
+              </w:rPr>
+              <w:t>–</w:t>
+            </w:r>
+            <w:r>
+              <w:rPr>
+                <w:rFonts w:ascii="BRH Malayalam Extra" w:hAnsi="BRH Malayalam Extra" w:cs="BRH Malayalam Extra"/>
+                <w:sz w:val="40"/>
+                <w:szCs w:val="40"/>
+              </w:rPr>
+              <w:t>¥m</w:t>
+            </w:r>
+          </w:p>
+        </w:tc>
+      </w:tr>
+      <w:tr>
+        <w:trPr>
           <w:trHeight w:val="1163"/>
         </w:trPr>
         <w:tc>
@@ -2051,7 +1816,6 @@
                 <w:szCs w:val="28"/>
                 <w:lang w:eastAsia="en-IN" w:bidi="ml-IN"/>
               </w:rPr>
-              <w:lastRenderedPageBreak/>
               <w:t>TS 2.</w:t>
             </w:r>
             <w:r>
@@ -3669,7 +3433,6 @@
                 <w:szCs w:val="28"/>
                 <w:lang w:bidi="ta-IN"/>
               </w:rPr>
-              <w:lastRenderedPageBreak/>
               <w:t>TS 2.2.</w:t>
             </w:r>
             <w:r>
@@ -4142,6 +3905,7 @@
                 <w:szCs w:val="28"/>
                 <w:lang w:bidi="ta-IN"/>
               </w:rPr>
+              <w:lastRenderedPageBreak/>
               <w:t>TS 2.2.4.7 (Vaakyam)</w:t>
             </w:r>
           </w:p>
@@ -5371,7 +5135,6 @@
           <w:b/>
           <w:bCs/>
         </w:rPr>
-        <w:lastRenderedPageBreak/>
         <w:t>(ignore those which are already incorporated in your book’s version and date)</w:t>
       </w:r>
     </w:p>
@@ -6030,6 +5793,7 @@
                 <w:szCs w:val="28"/>
                 <w:lang w:bidi="ta-IN"/>
               </w:rPr>
+              <w:lastRenderedPageBreak/>
               <w:t>TS 2.2.1.3 (Padam)</w:t>
             </w:r>
           </w:p>
@@ -7732,7 +7496,6 @@
                 <w:szCs w:val="28"/>
                 <w:lang w:bidi="ta-IN"/>
               </w:rPr>
-              <w:lastRenderedPageBreak/>
               <w:t>TS 2.2.6.3</w:t>
             </w:r>
             <w:r>
@@ -8287,6 +8050,7 @@
                 <w:szCs w:val="28"/>
                 <w:lang w:bidi="ta-IN"/>
               </w:rPr>
+              <w:lastRenderedPageBreak/>
               <w:t>TS 2.2.7.1 (vaakyam)</w:t>
             </w:r>
           </w:p>
@@ -9903,7 +9667,6 @@
           <w:szCs w:val="32"/>
           <w:u w:val="single"/>
         </w:rPr>
-        <w:lastRenderedPageBreak/>
         <w:t>===========</w:t>
       </w:r>
     </w:p>
@@ -10979,7 +10742,6 @@
                 <w:sz w:val="32"/>
                 <w:szCs w:val="32"/>
               </w:rPr>
-              <w:lastRenderedPageBreak/>
               <w:t xml:space="preserve">TS 2.2.1.4 - </w:t>
             </w:r>
             <w:r>
@@ -11683,6 +11445,7 @@
                 <w:szCs w:val="28"/>
                 <w:lang w:bidi="ta-IN"/>
               </w:rPr>
+              <w:lastRenderedPageBreak/>
               <w:t>TS</w:t>
             </w:r>
             <w:r>
@@ -13183,7 +12946,6 @@
                 <w:szCs w:val="28"/>
                 <w:lang w:bidi="ta-IN"/>
               </w:rPr>
-              <w:lastRenderedPageBreak/>
               <w:t>TS</w:t>
             </w:r>
             <w:r>
@@ -13556,6 +13318,7 @@
                 <w:szCs w:val="28"/>
                 <w:lang w:bidi="ta-IN"/>
               </w:rPr>
+              <w:lastRenderedPageBreak/>
               <w:t>TS</w:t>
             </w:r>
             <w:r>
@@ -14993,6 +14756,7 @@
           <w:szCs w:val="32"/>
           <w:u w:val="single"/>
         </w:rPr>
+        <w:lastRenderedPageBreak/>
         <w:t>TS</w:t>
       </w:r>
       <w:r>

</xml_diff>